<commit_message>
intro and problem statement updated.
</commit_message>
<xml_diff>
--- a/report/Word_Report/Capstone Report.docx
+++ b/report/Word_Report/Capstone Report.docx
@@ -1,6 +1,6 @@
 
 <file path=word/document.xml><?xml version="1.0" encoding="utf-8"?>
-<w:document xmlns:wpc="http://schemas.microsoft.com/office/word/2010/wordprocessingCanvas" xmlns:cx="http://schemas.microsoft.com/office/drawing/2014/chartex" xmlns:mc="http://schemas.openxmlformats.org/markup-compatibility/2006" xmlns:o="urn:schemas-microsoft-com:office:office" xmlns:r="http://schemas.openxmlformats.org/officeDocument/2006/relationships" xmlns:m="http://schemas.openxmlformats.org/officeDocument/2006/math" xmlns:v="urn:schemas-microsoft-com:vml" xmlns:wp14="http://schemas.microsoft.com/office/word/2010/wordprocessingDrawing" xmlns:wp="http://schemas.openxmlformats.org/drawingml/2006/wordprocessingDrawing" xmlns:w10="urn:schemas-microsoft-com:office:word" xmlns:w="http://schemas.openxmlformats.org/wordprocessingml/2006/main" xmlns:w14="http://schemas.microsoft.com/office/word/2010/wordml" xmlns:w15="http://schemas.microsoft.com/office/word/2012/wordml" xmlns:w16se="http://schemas.microsoft.com/office/word/2015/wordml/symex" xmlns:wpg="http://schemas.microsoft.com/office/word/2010/wordprocessingGroup" xmlns:wpi="http://schemas.microsoft.com/office/word/2010/wordprocessingInk" xmlns:wne="http://schemas.microsoft.com/office/word/2006/wordml" xmlns:wps="http://schemas.microsoft.com/office/word/2010/wordprocessingShape" mc:Ignorable="w14 w15 w16se wp14">
+<w:document xmlns:wpc="http://schemas.microsoft.com/office/word/2010/wordprocessingCanvas" xmlns:cx="http://schemas.microsoft.com/office/drawing/2014/chartex" xmlns:cx1="http://schemas.microsoft.com/office/drawing/2015/9/8/chartex" xmlns:cx2="http://schemas.microsoft.com/office/drawing/2015/10/21/chartex" xmlns:cx3="http://schemas.microsoft.com/office/drawing/2016/5/9/chartex" xmlns:cx4="http://schemas.microsoft.com/office/drawing/2016/5/10/chartex" xmlns:cx5="http://schemas.microsoft.com/office/drawing/2016/5/11/chartex" xmlns:cx6="http://schemas.microsoft.com/office/drawing/2016/5/12/chartex" xmlns:cx7="http://schemas.microsoft.com/office/drawing/2016/5/13/chartex" xmlns:cx8="http://schemas.microsoft.com/office/drawing/2016/5/14/chartex" xmlns:mc="http://schemas.openxmlformats.org/markup-compatibility/2006" xmlns:aink="http://schemas.microsoft.com/office/drawing/2016/ink" xmlns:am3d="http://schemas.microsoft.com/office/drawing/2017/model3d" xmlns:o="urn:schemas-microsoft-com:office:office" xmlns:oel="http://schemas.microsoft.com/office/2019/extlst" xmlns:r="http://schemas.openxmlformats.org/officeDocument/2006/relationships" xmlns:m="http://schemas.openxmlformats.org/officeDocument/2006/math" xmlns:v="urn:schemas-microsoft-com:vml" xmlns:wp14="http://schemas.microsoft.com/office/word/2010/wordprocessingDrawing" xmlns:wp="http://schemas.openxmlformats.org/drawingml/2006/wordprocessingDrawing" xmlns:w10="urn:schemas-microsoft-com:office:word" xmlns:w="http://schemas.openxmlformats.org/wordprocessingml/2006/main" xmlns:w14="http://schemas.microsoft.com/office/word/2010/wordml" xmlns:w15="http://schemas.microsoft.com/office/word/2012/wordml" xmlns:w16cex="http://schemas.microsoft.com/office/word/2018/wordml/cex" xmlns:w16cid="http://schemas.microsoft.com/office/word/2016/wordml/cid" xmlns:w16="http://schemas.microsoft.com/office/word/2018/wordml" xmlns:w16du="http://schemas.microsoft.com/office/word/2023/wordml/word16du" xmlns:w16sdtdh="http://schemas.microsoft.com/office/word/2020/wordml/sdtdatahash" xmlns:w16sdtfl="http://schemas.microsoft.com/office/word/2024/wordml/sdtformatlock" xmlns:w16se="http://schemas.microsoft.com/office/word/2015/wordml/symex" xmlns:wpg="http://schemas.microsoft.com/office/word/2010/wordprocessingGroup" xmlns:wpi="http://schemas.microsoft.com/office/word/2010/wordprocessingInk" xmlns:wne="http://schemas.microsoft.com/office/word/2006/wordml" xmlns:wps="http://schemas.microsoft.com/office/word/2010/wordprocessingShape" mc:Ignorable="w14 w15 w16se w16cid w16 w16cex w16sdtdh w16sdtfl w16du wp14">
   <w:body>
     <w:p>
       <w:pPr>
@@ -399,24 +399,27 @@
           <w:szCs w:val="29"/>
         </w:rPr>
       </w:pPr>
-      <w:proofErr w:type="spellStart"/>
       <w:r>
         <w:rPr>
           <w:rFonts w:asciiTheme="majorBidi" w:hAnsiTheme="majorBidi" w:cstheme="majorBidi"/>
           <w:sz w:val="29"/>
           <w:szCs w:val="29"/>
         </w:rPr>
-        <w:t>Parv</w:t>
-      </w:r>
-      <w:proofErr w:type="spellEnd"/>
-      <w:r>
+        <w:t>Parv Bhargava</w:t>
+      </w:r>
+    </w:p>
+    <w:p>
+      <w:pPr>
+        <w:autoSpaceDE w:val="0"/>
+        <w:autoSpaceDN w:val="0"/>
+        <w:adjustRightInd w:val="0"/>
+        <w:spacing w:after="0" w:line="240" w:lineRule="auto"/>
         <w:rPr>
           <w:rFonts w:asciiTheme="majorBidi" w:hAnsiTheme="majorBidi" w:cstheme="majorBidi"/>
           <w:sz w:val="29"/>
           <w:szCs w:val="29"/>
         </w:rPr>
-        <w:t xml:space="preserve"> Bhargava</w:t>
-      </w:r>
+      </w:pPr>
     </w:p>
     <w:p>
       <w:pPr>
@@ -437,19 +440,6 @@
         <w:autoSpaceDN w:val="0"/>
         <w:adjustRightInd w:val="0"/>
         <w:spacing w:after="0" w:line="240" w:lineRule="auto"/>
-        <w:rPr>
-          <w:rFonts w:asciiTheme="majorBidi" w:hAnsiTheme="majorBidi" w:cstheme="majorBidi"/>
-          <w:sz w:val="29"/>
-          <w:szCs w:val="29"/>
-        </w:rPr>
-      </w:pPr>
-    </w:p>
-    <w:p>
-      <w:pPr>
-        <w:autoSpaceDE w:val="0"/>
-        <w:autoSpaceDN w:val="0"/>
-        <w:adjustRightInd w:val="0"/>
-        <w:spacing w:after="0" w:line="240" w:lineRule="auto"/>
         <w:jc w:val="center"/>
         <w:rPr>
           <w:rFonts w:asciiTheme="majorBidi" w:hAnsiTheme="majorBidi" w:cstheme="majorBidi"/>
@@ -477,16 +467,8 @@
         <w:rPr>
           <w:rFonts w:asciiTheme="majorBidi" w:hAnsiTheme="majorBidi" w:cstheme="majorBidi"/>
         </w:rPr>
-        <w:t xml:space="preserve">Amir </w:t>
-      </w:r>
-      <w:proofErr w:type="spellStart"/>
-      <w:r>
-        <w:rPr>
-          <w:rFonts w:asciiTheme="majorBidi" w:hAnsiTheme="majorBidi" w:cstheme="majorBidi"/>
-        </w:rPr>
-        <w:t>Jafari</w:t>
-      </w:r>
-      <w:proofErr w:type="spellEnd"/>
+        <w:t>Amir Jafari</w:t>
+      </w:r>
     </w:p>
     <w:p>
       <w:pPr>
@@ -860,16 +842,7 @@
                               <w:t xml:space="preserve"> </w:t>
                             </w:r>
                             <w:r>
-                              <w:t>W</w:t>
-                            </w:r>
-                            <w:r>
-                              <w:t>e demonstrate that a baseline single LLM solution</w:t>
-                            </w:r>
-                            <w:r>
-                              <w:t xml:space="preserve"> </w:t>
-                            </w:r>
-                            <w:r>
-                              <w:t xml:space="preserve">performs poorly when tasked with generating treatment plans. To overcome these limitations, we propose an </w:t>
+                              <w:t xml:space="preserve">We demonstrate that a baseline single LLM solution performs poorly when tasked with generating treatment plans. To overcome these limitations, we propose an </w:t>
                             </w:r>
                             <w:r>
                               <w:rPr>
@@ -914,13 +887,7 @@
                               <w:t xml:space="preserve"> by incorporating a </w:t>
                             </w:r>
                             <w:r>
-                              <w:t>multi-agent system that dynamically creates agents based on the professions represented in each case study.</w:t>
-                            </w:r>
-                            <w:r>
-                              <w:t xml:space="preserve"> </w:t>
-                            </w:r>
-                            <w:r>
-                              <w:t>Rather than relying on a hardcoded set of agents, our system extracts team member roles from real-world inter</w:t>
+                              <w:t>multi-agent system that dynamically creates agents based on the professions represented in each case study. Rather than relying on a hardcoded set of agents, our system extracts team member roles from real-world inter</w:t>
                             </w:r>
                             <w:r>
                               <w:t>-</w:t>
@@ -932,12 +899,7 @@
                               <w:t>-</w:t>
                             </w:r>
                             <w:r>
-                              <w:t>professional collaboration. Our experiments show that this specialized, collaborative framework significantly outperforms the general-purpose LLM, pavin</w:t>
-                            </w:r>
-                            <w:bookmarkStart w:id="0" w:name="_GoBack"/>
-                            <w:bookmarkEnd w:id="0"/>
-                            <w:r>
-                              <w:t>g the way for improved, context-aware treatment planning in clinical settings.</w:t>
+                              <w:t>professional collaboration. Our experiments show that this specialized, collaborative framework significantly outperforms the general-purpose LLM, paving the way for improved, context-aware treatment planning in clinical settings.</w:t>
                             </w:r>
                           </w:p>
                           <w:p>
@@ -988,7 +950,7 @@
                 <v:stroke joinstyle="miter"/>
                 <v:path gradientshapeok="t" o:connecttype="rect"/>
               </v:shapetype>
-              <v:shape id="Text Box 2" o:spid="_x0000_s1026" type="#_x0000_t202" style="position:absolute;left:0;text-align:left;margin-left:415.6pt;margin-top:21pt;width:466.8pt;height:223.2pt;z-index:251661312;visibility:visible;mso-wrap-style:square;mso-width-percent:0;mso-height-percent:0;mso-wrap-distance-left:9pt;mso-wrap-distance-top:3.6pt;mso-wrap-distance-right:9pt;mso-wrap-distance-bottom:3.6pt;mso-position-horizontal:right;mso-position-horizontal-relative:margin;mso-position-vertical:absolute;mso-position-vertical-relative:text;mso-width-percent:0;mso-height-percent:0;mso-width-relative:margin;mso-height-relative:margin;v-text-anchor:top" o:gfxdata="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" strokecolor="white [3212]">
+              <v:shape id="Text Box 2" o:spid="_x0000_s1026" type="#_x0000_t202" style="position:absolute;left:0;text-align:left;margin-left:415.6pt;margin-top:21pt;width:466.8pt;height:223.2pt;z-index:251661312;visibility:visible;mso-wrap-style:square;mso-width-percent:0;mso-height-percent:0;mso-wrap-distance-left:9pt;mso-wrap-distance-top:3.6pt;mso-wrap-distance-right:9pt;mso-wrap-distance-bottom:3.6pt;mso-position-horizontal:right;mso-position-horizontal-relative:margin;mso-position-vertical:absolute;mso-position-vertical-relative:text;mso-width-percent:0;mso-height-percent:0;mso-width-relative:margin;mso-height-relative:margin;v-text-anchor:top" o:gfxdata="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" strokecolor="white [3212]">
                 <v:textbox>
                   <w:txbxContent>
                     <w:p>
@@ -1079,16 +1041,7 @@
                         <w:t xml:space="preserve"> </w:t>
                       </w:r>
                       <w:r>
-                        <w:t>W</w:t>
-                      </w:r>
-                      <w:r>
-                        <w:t>e demonstrate that a baseline single LLM solution</w:t>
-                      </w:r>
-                      <w:r>
-                        <w:t xml:space="preserve"> </w:t>
-                      </w:r>
-                      <w:r>
-                        <w:t xml:space="preserve">performs poorly when tasked with generating treatment plans. To overcome these limitations, we propose an </w:t>
+                        <w:t xml:space="preserve">We demonstrate that a baseline single LLM solution performs poorly when tasked with generating treatment plans. To overcome these limitations, we propose an </w:t>
                       </w:r>
                       <w:r>
                         <w:rPr>
@@ -1133,13 +1086,7 @@
                         <w:t xml:space="preserve"> by incorporating a </w:t>
                       </w:r>
                       <w:r>
-                        <w:t>multi-agent system that dynamically creates agents based on the professions represented in each case study.</w:t>
-                      </w:r>
-                      <w:r>
-                        <w:t xml:space="preserve"> </w:t>
-                      </w:r>
-                      <w:r>
-                        <w:t>Rather than relying on a hardcoded set of agents, our system extracts team member roles from real-world inter</w:t>
+                        <w:t>multi-agent system that dynamically creates agents based on the professions represented in each case study. Rather than relying on a hardcoded set of agents, our system extracts team member roles from real-world inter</w:t>
                       </w:r>
                       <w:r>
                         <w:t>-</w:t>
@@ -1151,12 +1098,7 @@
                         <w:t>-</w:t>
                       </w:r>
                       <w:r>
-                        <w:t>professional collaboration. Our experiments show that this specialized, collaborative framework significantly outperforms the general-purpose LLM, pavin</w:t>
-                      </w:r>
-                      <w:bookmarkStart w:id="1" w:name="_GoBack"/>
-                      <w:bookmarkEnd w:id="1"/>
-                      <w:r>
-                        <w:t>g the way for improved, context-aware treatment planning in clinical settings.</w:t>
+                        <w:t>professional collaboration. Our experiments show that this specialized, collaborative framework significantly outperforms the general-purpose LLM, paving the way for improved, context-aware treatment planning in clinical settings.</w:t>
                       </w:r>
                     </w:p>
                     <w:p>
@@ -2616,85 +2558,231 @@
       <w:pPr>
         <w:pStyle w:val="Heading1"/>
       </w:pPr>
-      <w:bookmarkStart w:id="2" w:name="_Toc91714543"/>
+      <w:bookmarkStart w:id="0" w:name="_Toc91714543"/>
       <w:r>
         <w:lastRenderedPageBreak/>
         <w:t>Introduction</w:t>
       </w:r>
+      <w:bookmarkEnd w:id="0"/>
+    </w:p>
+    <w:p>
+      <w:pPr>
+        <w:autoSpaceDE w:val="0"/>
+        <w:autoSpaceDN w:val="0"/>
+        <w:adjustRightInd w:val="0"/>
+        <w:spacing w:after="0" w:line="240" w:lineRule="auto"/>
+      </w:pPr>
+    </w:p>
+    <w:p>
+      <w:pPr>
+        <w:jc w:val="both"/>
+        <w:rPr>
+          <w:rFonts w:asciiTheme="majorBidi" w:hAnsiTheme="majorBidi" w:cstheme="majorBidi"/>
+          <w:lang w:val="en-IN"/>
+        </w:rPr>
+      </w:pPr>
+      <w:bookmarkStart w:id="1" w:name="_Hlk190784919"/>
+      <w:r>
+        <w:rPr>
+          <w:rFonts w:asciiTheme="majorBidi" w:hAnsiTheme="majorBidi" w:cstheme="majorBidi"/>
+          <w:lang w:val="en-IN"/>
+        </w:rPr>
+        <w:t>Interprofessional Education (IPE) is a pedagogical approach that brings together students from various healthcare disciplines to learn collaboratively, aiming to enhance teamwork and improve patient outcomes. Despite its recognized importance, implementing effective IPE within medical and public health education faces numerous challenges, including curriculum integration, scheduling conflicts, and resource limitations.</w:t>
+      </w:r>
+    </w:p>
+    <w:p>
+      <w:pPr>
+        <w:jc w:val="both"/>
+        <w:rPr>
+          <w:rFonts w:asciiTheme="majorBidi" w:hAnsiTheme="majorBidi" w:cstheme="majorBidi"/>
+          <w:lang w:val="en-IN"/>
+        </w:rPr>
+      </w:pPr>
+      <w:r>
+        <w:rPr>
+          <w:rFonts w:asciiTheme="majorBidi" w:hAnsiTheme="majorBidi" w:cstheme="majorBidi"/>
+          <w:lang w:val="en-IN"/>
+        </w:rPr>
+        <w:t xml:space="preserve">We demonstrate that a baseline single LLM solution performs poorly when tasked with generating treatment plans. To overcome these limitations, we propose an innovative approach that simulates real-world healthcare team interactions by incorporating a multi-agent system that dynamically creates agents based on the professions represented in each case study. Rather than relying on a hardcoded set of agents, our system extracts team member roles from real-world inter-professional case studies and assigns each agent the domain-specific knowledge and responsibilities of its corresponding profession. This approach allows, for example, a nurse agent to provide </w:t>
+      </w:r>
+      <w:bookmarkEnd w:id="1"/>
+      <w:r>
+        <w:rPr>
+          <w:rFonts w:asciiTheme="majorBidi" w:hAnsiTheme="majorBidi" w:cstheme="majorBidi"/>
+          <w:lang w:val="en-IN"/>
+        </w:rPr>
+        <w:t>patient care insights and an oncologist agent to deliver targeted cancer treatment advice, closely mirroring real-world inter-professional collaboration.</w:t>
+      </w:r>
+    </w:p>
+    <w:p>
+      <w:pPr>
+        <w:jc w:val="both"/>
+        <w:rPr>
+          <w:rFonts w:asciiTheme="majorBidi" w:hAnsiTheme="majorBidi" w:cstheme="majorBidi"/>
+          <w:i/>
+          <w:iCs/>
+          <w:lang w:val="en-IN"/>
+        </w:rPr>
+      </w:pPr>
+      <w:r>
+        <w:rPr>
+          <w:rFonts w:asciiTheme="majorBidi" w:hAnsiTheme="majorBidi" w:cstheme="majorBidi"/>
+          <w:lang w:val="en-IN"/>
+        </w:rPr>
+        <w:t>To address these issues, we propose the development of a synergistic multi-agent AI system designed to simulate educational conversations among diverse healthcare team members and generate treatment plans. By leveraging advanced technologies such as open-source Large Language Models (LLMs) and our novel agentic architecture, we compare its performance with a basic LLM response using evaluation metrics like BLEU and ROUGE scores</w:t>
+      </w:r>
+      <w:r>
+        <w:rPr>
+          <w:rFonts w:asciiTheme="majorBidi" w:hAnsiTheme="majorBidi" w:cstheme="majorBidi"/>
+          <w:i/>
+          <w:iCs/>
+          <w:lang w:val="en-IN"/>
+        </w:rPr>
+        <w:t xml:space="preserve">. </w:t>
+      </w:r>
+    </w:p>
+    <w:p>
+      <w:pPr>
+        <w:jc w:val="both"/>
+        <w:rPr>
+          <w:rFonts w:asciiTheme="majorBidi" w:hAnsiTheme="majorBidi" w:cstheme="majorBidi"/>
+          <w:i/>
+          <w:iCs/>
+          <w:lang w:val="en-IN"/>
+        </w:rPr>
+      </w:pPr>
+      <w:r>
+        <w:rPr>
+          <w:rFonts w:asciiTheme="majorBidi" w:hAnsiTheme="majorBidi" w:cstheme="majorBidi"/>
+          <w:i/>
+          <w:iCs/>
+          <w:lang w:val="en-IN"/>
+        </w:rPr>
+        <w:t xml:space="preserve">TODO: </w:t>
+      </w:r>
+      <w:r>
+        <w:rPr>
+          <w:rFonts w:asciiTheme="majorBidi" w:hAnsiTheme="majorBidi" w:cstheme="majorBidi"/>
+          <w:i/>
+          <w:iCs/>
+          <w:lang w:val="en-IN"/>
+        </w:rPr>
+        <w:t>Our experiments show that this specialized, collaborative framework significantly outperforms general-purpose LLMs, paving the way for improved, context-aware treatment planning in clinical settings.</w:t>
+      </w:r>
+    </w:p>
+    <w:p>
+      <w:pPr>
+        <w:pStyle w:val="Heading1"/>
+      </w:pPr>
+      <w:bookmarkStart w:id="2" w:name="_Toc91714544"/>
+      <w:r>
+        <w:t>Problem Statement</w:t>
+      </w:r>
       <w:bookmarkEnd w:id="2"/>
     </w:p>
-    <w:p>
-      <w:pPr>
-        <w:autoSpaceDE w:val="0"/>
-        <w:autoSpaceDN w:val="0"/>
-        <w:adjustRightInd w:val="0"/>
-        <w:spacing w:after="0" w:line="240" w:lineRule="auto"/>
-      </w:pPr>
-    </w:p>
-    <w:p>
-      <w:pPr>
-        <w:autoSpaceDE w:val="0"/>
-        <w:autoSpaceDN w:val="0"/>
-        <w:adjustRightInd w:val="0"/>
-        <w:spacing w:after="0" w:line="240" w:lineRule="auto"/>
-        <w:rPr>
-          <w:rFonts w:asciiTheme="majorBidi" w:hAnsiTheme="majorBidi" w:cstheme="majorBidi"/>
-        </w:rPr>
-      </w:pPr>
-      <w:r>
-        <w:rPr>
-          <w:rFonts w:asciiTheme="majorBidi" w:hAnsiTheme="majorBidi" w:cstheme="majorBidi"/>
-        </w:rPr>
-        <w:t>Your introduction brie</w:t>
-      </w:r>
-      <w:r>
-        <w:rPr>
-          <w:rFonts w:asciiTheme="majorBidi" w:hAnsiTheme="majorBidi" w:cstheme="majorBidi"/>
-        </w:rPr>
-        <w:t>fly</w:t>
-      </w:r>
-      <w:r>
-        <w:rPr>
-          <w:rFonts w:asciiTheme="majorBidi" w:hAnsiTheme="majorBidi" w:cstheme="majorBidi"/>
-        </w:rPr>
-        <w:t xml:space="preserve"> explains the problem you address, and what you've achieved towards</w:t>
-      </w:r>
-    </w:p>
-    <w:p>
-      <w:pPr>
-        <w:autoSpaceDE w:val="0"/>
-        <w:autoSpaceDN w:val="0"/>
-        <w:adjustRightInd w:val="0"/>
-        <w:spacing w:after="0" w:line="240" w:lineRule="auto"/>
-        <w:rPr>
-          <w:rFonts w:asciiTheme="majorBidi" w:hAnsiTheme="majorBidi" w:cstheme="majorBidi"/>
-        </w:rPr>
-      </w:pPr>
-      <w:r>
-        <w:rPr>
-          <w:rFonts w:asciiTheme="majorBidi" w:hAnsiTheme="majorBidi" w:cstheme="majorBidi"/>
-        </w:rPr>
-        <w:t>solving the problem. It's an edited and updated version of your context and objectives from your</w:t>
-      </w:r>
-    </w:p>
-    <w:p>
-      <w:pPr>
-        <w:rPr>
-          <w:rFonts w:asciiTheme="majorBidi" w:hAnsiTheme="majorBidi" w:cstheme="majorBidi"/>
-        </w:rPr>
-      </w:pPr>
-      <w:r>
-        <w:rPr>
-          <w:rFonts w:asciiTheme="majorBidi" w:hAnsiTheme="majorBidi" w:cstheme="majorBidi"/>
-        </w:rPr>
-        <w:t>topic outline document.</w:t>
-      </w:r>
-    </w:p>
-    <w:p>
-      <w:pPr>
-        <w:ind w:left="360"/>
-        <w:rPr>
-          <w:rFonts w:asciiTheme="majorBidi" w:hAnsiTheme="majorBidi" w:cstheme="majorBidi"/>
+    <w:p/>
+    <w:p>
+      <w:pPr>
+        <w:autoSpaceDE w:val="0"/>
+        <w:autoSpaceDN w:val="0"/>
+        <w:adjustRightInd w:val="0"/>
+        <w:spacing w:after="0" w:line="240" w:lineRule="auto"/>
+        <w:jc w:val="both"/>
+        <w:rPr>
+          <w:rFonts w:asciiTheme="majorBidi" w:hAnsiTheme="majorBidi" w:cstheme="majorBidi"/>
+          <w:lang w:val="en-IN"/>
+        </w:rPr>
+      </w:pPr>
+      <w:r>
+        <w:rPr>
+          <w:rFonts w:asciiTheme="majorBidi" w:hAnsiTheme="majorBidi" w:cstheme="majorBidi"/>
+          <w:lang w:val="en-IN"/>
+        </w:rPr>
+        <w:t>Effective interprofessional collaboration is essential for high-quality patient care, yet traditional educational methods struggle to adequately prepare students for real-world teamwork. Key challenges include difficulties in coordinating cross-disciplinary training, a lack of realistic simulations, and constraints on faculty resources. Furthermore, existing AI-driven educational tools often fail to capture the nuanced decision-making processes that occur in interprofessional healthcare settings.</w:t>
+      </w:r>
+    </w:p>
+    <w:p>
+      <w:pPr>
+        <w:autoSpaceDE w:val="0"/>
+        <w:autoSpaceDN w:val="0"/>
+        <w:adjustRightInd w:val="0"/>
+        <w:spacing w:after="0" w:line="240" w:lineRule="auto"/>
+        <w:jc w:val="both"/>
+        <w:rPr>
+          <w:rFonts w:asciiTheme="majorBidi" w:hAnsiTheme="majorBidi" w:cstheme="majorBidi"/>
+          <w:lang w:val="en-IN"/>
+        </w:rPr>
+      </w:pPr>
+    </w:p>
+    <w:p>
+      <w:pPr>
+        <w:autoSpaceDE w:val="0"/>
+        <w:autoSpaceDN w:val="0"/>
+        <w:adjustRightInd w:val="0"/>
+        <w:spacing w:after="0" w:line="240" w:lineRule="auto"/>
+        <w:jc w:val="both"/>
+        <w:rPr>
+          <w:rFonts w:asciiTheme="majorBidi" w:hAnsiTheme="majorBidi" w:cstheme="majorBidi"/>
+          <w:lang w:val="en-IN"/>
+        </w:rPr>
+      </w:pPr>
+      <w:r>
+        <w:rPr>
+          <w:rFonts w:asciiTheme="majorBidi" w:hAnsiTheme="majorBidi" w:cstheme="majorBidi"/>
+          <w:lang w:val="en-IN"/>
+        </w:rPr>
+        <w:t>A single Large Language Model (LLM) approach lacks the specialization necessary to replicate the dynamic interplay between diverse healthcare professionals. This limitation leads to suboptimal educational outcomes, as students do not experience the complexities of interprofessional collaboration in a meaningful way.</w:t>
+      </w:r>
+    </w:p>
+    <w:p>
+      <w:pPr>
+        <w:autoSpaceDE w:val="0"/>
+        <w:autoSpaceDN w:val="0"/>
+        <w:adjustRightInd w:val="0"/>
+        <w:spacing w:after="0" w:line="240" w:lineRule="auto"/>
+        <w:jc w:val="both"/>
+        <w:rPr>
+          <w:rFonts w:asciiTheme="majorBidi" w:hAnsiTheme="majorBidi" w:cstheme="majorBidi"/>
+          <w:lang w:val="en-IN"/>
+        </w:rPr>
+      </w:pPr>
+    </w:p>
+    <w:p>
+      <w:pPr>
+        <w:autoSpaceDE w:val="0"/>
+        <w:autoSpaceDN w:val="0"/>
+        <w:adjustRightInd w:val="0"/>
+        <w:spacing w:after="0" w:line="240" w:lineRule="auto"/>
+        <w:jc w:val="both"/>
+        <w:rPr>
+          <w:rFonts w:asciiTheme="majorBidi" w:hAnsiTheme="majorBidi" w:cstheme="majorBidi"/>
+          <w:lang w:val="en-IN"/>
+        </w:rPr>
+      </w:pPr>
+      <w:r>
+        <w:rPr>
+          <w:rFonts w:asciiTheme="majorBidi" w:hAnsiTheme="majorBidi" w:cstheme="majorBidi"/>
+          <w:lang w:val="en-IN"/>
+        </w:rPr>
+        <w:t>To bridge this gap, our project proposes the development of a multi-agent AI system that can dynamically generate specialized virtual team members based on real-world case studies. This system will provide medical and public health students with a scalable and interactive platform to engage in simulated interprofessional education, addressing the limitations of current methods and enhancing their readiness for clinical practice.</w:t>
+      </w:r>
+    </w:p>
+    <w:p>
+      <w:pPr>
+        <w:autoSpaceDE w:val="0"/>
+        <w:autoSpaceDN w:val="0"/>
+        <w:adjustRightInd w:val="0"/>
+        <w:spacing w:after="0" w:line="240" w:lineRule="auto"/>
+        <w:rPr>
+          <w:rFonts w:asciiTheme="majorBidi" w:hAnsiTheme="majorBidi" w:cstheme="majorBidi"/>
+        </w:rPr>
+      </w:pPr>
+    </w:p>
+    <w:p>
+      <w:pPr>
+        <w:ind w:firstLine="360"/>
+        <w:rPr>
+          <w:rFonts w:ascii="F31" w:hAnsi="F31" w:cs="F31"/>
         </w:rPr>
       </w:pPr>
     </w:p>
@@ -2702,47 +2790,12 @@
       <w:pPr>
         <w:pStyle w:val="Heading1"/>
       </w:pPr>
-      <w:bookmarkStart w:id="3" w:name="_Toc91714544"/>
-      <w:r>
-        <w:t>Problem Statement</w:t>
+      <w:bookmarkStart w:id="3" w:name="_Toc91714545"/>
+      <w:r>
+        <w:lastRenderedPageBreak/>
+        <w:t>Related Work</w:t>
       </w:r>
       <w:bookmarkEnd w:id="3"/>
-    </w:p>
-    <w:p/>
-    <w:p>
-      <w:pPr>
-        <w:autoSpaceDE w:val="0"/>
-        <w:autoSpaceDN w:val="0"/>
-        <w:adjustRightInd w:val="0"/>
-        <w:spacing w:after="0" w:line="240" w:lineRule="auto"/>
-        <w:rPr>
-          <w:rFonts w:asciiTheme="majorBidi" w:hAnsiTheme="majorBidi" w:cstheme="majorBidi"/>
-        </w:rPr>
-      </w:pPr>
-      <w:r>
-        <w:rPr>
-          <w:rFonts w:asciiTheme="majorBidi" w:hAnsiTheme="majorBidi" w:cstheme="majorBidi"/>
-        </w:rPr>
-        <w:t>Add problem statement here and challenges of the project.</w:t>
-      </w:r>
-    </w:p>
-    <w:p>
-      <w:pPr>
-        <w:ind w:firstLine="360"/>
-        <w:rPr>
-          <w:rFonts w:ascii="F31" w:hAnsi="F31" w:cs="F31"/>
-        </w:rPr>
-      </w:pPr>
-    </w:p>
-    <w:p>
-      <w:pPr>
-        <w:pStyle w:val="Heading1"/>
-      </w:pPr>
-      <w:bookmarkStart w:id="4" w:name="_Toc91714545"/>
-      <w:r>
-        <w:t>Related Work</w:t>
-      </w:r>
-      <w:bookmarkEnd w:id="4"/>
     </w:p>
     <w:p/>
     <w:p>
@@ -2866,7 +2919,6 @@
           <w:id w:val="-1455556719"/>
           <w:citation/>
         </w:sdtPr>
-        <w:sdtEndPr/>
         <w:sdtContent>
           <w:r>
             <w:rPr>
@@ -2966,7 +3018,6 @@
           <w:id w:val="-72051647"/>
           <w:citation/>
         </w:sdtPr>
-        <w:sdtEndPr/>
         <w:sdtContent>
           <w:r>
             <w:rPr>
@@ -3015,7 +3066,6 @@
           <w:id w:val="-1587838606"/>
           <w:citation/>
         </w:sdtPr>
-        <w:sdtEndPr/>
         <w:sdtContent>
           <w:r>
             <w:rPr>
@@ -3079,7 +3129,6 @@
           <w:id w:val="-441303741"/>
           <w:citation/>
         </w:sdtPr>
-        <w:sdtEndPr/>
         <w:sdtContent>
           <w:r>
             <w:rPr>
@@ -3140,11 +3189,11 @@
       <w:pPr>
         <w:pStyle w:val="Heading1"/>
       </w:pPr>
-      <w:bookmarkStart w:id="5" w:name="_Toc91714546"/>
+      <w:bookmarkStart w:id="4" w:name="_Toc91714546"/>
       <w:r>
         <w:t>Solution and Methodology</w:t>
       </w:r>
-      <w:bookmarkEnd w:id="5"/>
+      <w:bookmarkEnd w:id="4"/>
     </w:p>
     <w:p>
       <w:pPr>
@@ -3304,7 +3353,6 @@
           <w:noProof/>
           <w:lang w:val="en-IN" w:eastAsia="en-IN"/>
         </w:rPr>
-        <w:lastRenderedPageBreak/>
         <w:drawing>
           <wp:inline distT="0" distB="0" distL="0" distR="0" wp14:anchorId="26528B00" wp14:editId="573EA89A">
             <wp:extent cx="5943600" cy="2971800"/>
@@ -3363,24 +3411,14 @@
       <w:r>
         <w:t xml:space="preserve">Figure </w:t>
       </w:r>
-      <w:r>
-        <w:fldChar w:fldCharType="begin"/>
-      </w:r>
-      <w:r>
-        <w:instrText xml:space="preserve"> SEQ Figure \* ARABIC </w:instrText>
-      </w:r>
-      <w:r>
-        <w:fldChar w:fldCharType="separate"/>
-      </w:r>
-      <w:r>
-        <w:rPr>
-          <w:noProof/>
-        </w:rPr>
-        <w:t>1</w:t>
-      </w:r>
-      <w:r>
-        <w:fldChar w:fldCharType="end"/>
-      </w:r>
+      <w:fldSimple w:instr=" SEQ Figure \* ARABIC ">
+        <w:r>
+          <w:rPr>
+            <w:noProof/>
+          </w:rPr>
+          <w:t>1</w:t>
+        </w:r>
+      </w:fldSimple>
       <w:r>
         <w:t xml:space="preserve">: </w:t>
       </w:r>
@@ -3456,11 +3494,12 @@
       <w:pPr>
         <w:pStyle w:val="Heading1"/>
       </w:pPr>
-      <w:bookmarkStart w:id="6" w:name="_Toc91714547"/>
-      <w:r>
+      <w:bookmarkStart w:id="5" w:name="_Toc91714547"/>
+      <w:r>
+        <w:lastRenderedPageBreak/>
         <w:t>Results and Discussion</w:t>
       </w:r>
-      <w:bookmarkEnd w:id="6"/>
+      <w:bookmarkEnd w:id="5"/>
     </w:p>
     <w:p/>
     <w:p>
@@ -3569,24 +3608,14 @@
       <w:r>
         <w:t xml:space="preserve">Figure </w:t>
       </w:r>
-      <w:r>
-        <w:fldChar w:fldCharType="begin"/>
-      </w:r>
-      <w:r>
-        <w:instrText xml:space="preserve"> SEQ Figure \* ARABIC </w:instrText>
-      </w:r>
-      <w:r>
-        <w:fldChar w:fldCharType="separate"/>
-      </w:r>
-      <w:r>
-        <w:rPr>
-          <w:noProof/>
-        </w:rPr>
-        <w:t>2</w:t>
-      </w:r>
-      <w:r>
-        <w:fldChar w:fldCharType="end"/>
-      </w:r>
+      <w:fldSimple w:instr=" SEQ Figure \* ARABIC ">
+        <w:r>
+          <w:rPr>
+            <w:noProof/>
+          </w:rPr>
+          <w:t>2</w:t>
+        </w:r>
+      </w:fldSimple>
       <w:r>
         <w:t xml:space="preserve">: </w:t>
       </w:r>
@@ -3658,62 +3687,62 @@
       <w:pPr>
         <w:pStyle w:val="Heading2"/>
       </w:pPr>
-      <w:bookmarkStart w:id="7" w:name="_Toc91714548"/>
+      <w:bookmarkStart w:id="6" w:name="_Toc91714548"/>
       <w:r>
         <w:t>Experimentation protocol</w:t>
       </w:r>
+      <w:bookmarkEnd w:id="6"/>
+    </w:p>
+    <w:p/>
+    <w:p>
+      <w:pPr>
+        <w:autoSpaceDE w:val="0"/>
+        <w:autoSpaceDN w:val="0"/>
+        <w:adjustRightInd w:val="0"/>
+        <w:spacing w:after="0" w:line="240" w:lineRule="auto"/>
+        <w:rPr>
+          <w:rFonts w:asciiTheme="majorBidi" w:hAnsiTheme="majorBidi" w:cstheme="majorBidi"/>
+        </w:rPr>
+      </w:pPr>
+      <w:r>
+        <w:rPr>
+          <w:rFonts w:asciiTheme="majorBidi" w:hAnsiTheme="majorBidi" w:cstheme="majorBidi"/>
+        </w:rPr>
+        <w:t>It is of the utmost importance to describe how you came up with the measurements and results</w:t>
+      </w:r>
+    </w:p>
+    <w:p>
+      <w:pPr>
+        <w:rPr>
+          <w:rFonts w:asciiTheme="majorBidi" w:hAnsiTheme="majorBidi" w:cstheme="majorBidi"/>
+        </w:rPr>
+      </w:pPr>
+      <w:r>
+        <w:rPr>
+          <w:rFonts w:asciiTheme="majorBidi" w:hAnsiTheme="majorBidi" w:cstheme="majorBidi"/>
+        </w:rPr>
+        <w:t>that support your evaluation.</w:t>
+      </w:r>
+    </w:p>
+    <w:p>
+      <w:pPr>
+        <w:rPr>
+          <w:rFonts w:asciiTheme="majorBidi" w:hAnsiTheme="majorBidi" w:cstheme="majorBidi"/>
+        </w:rPr>
+      </w:pPr>
+    </w:p>
+    <w:p>
+      <w:pPr>
+        <w:pStyle w:val="Heading2"/>
+        <w:rPr>
+          <w:rFonts w:asciiTheme="majorBidi" w:hAnsiTheme="majorBidi"/>
+        </w:rPr>
+      </w:pPr>
+      <w:bookmarkStart w:id="7" w:name="_Toc91714549"/>
+      <w:r>
+        <w:t>Data tables</w:t>
+      </w:r>
       <w:bookmarkEnd w:id="7"/>
-    </w:p>
-    <w:p/>
-    <w:p>
-      <w:pPr>
-        <w:autoSpaceDE w:val="0"/>
-        <w:autoSpaceDN w:val="0"/>
-        <w:adjustRightInd w:val="0"/>
-        <w:spacing w:after="0" w:line="240" w:lineRule="auto"/>
-        <w:rPr>
-          <w:rFonts w:asciiTheme="majorBidi" w:hAnsiTheme="majorBidi" w:cstheme="majorBidi"/>
-        </w:rPr>
-      </w:pPr>
-      <w:r>
-        <w:rPr>
-          <w:rFonts w:asciiTheme="majorBidi" w:hAnsiTheme="majorBidi" w:cstheme="majorBidi"/>
-        </w:rPr>
-        <w:t>It is of the utmost importance to describe how you came up with the measurements and results</w:t>
-      </w:r>
-    </w:p>
-    <w:p>
-      <w:pPr>
-        <w:rPr>
-          <w:rFonts w:asciiTheme="majorBidi" w:hAnsiTheme="majorBidi" w:cstheme="majorBidi"/>
-        </w:rPr>
-      </w:pPr>
-      <w:r>
-        <w:rPr>
-          <w:rFonts w:asciiTheme="majorBidi" w:hAnsiTheme="majorBidi" w:cstheme="majorBidi"/>
-        </w:rPr>
-        <w:t>that support your evaluation.</w:t>
-      </w:r>
-    </w:p>
-    <w:p>
-      <w:pPr>
-        <w:rPr>
-          <w:rFonts w:asciiTheme="majorBidi" w:hAnsiTheme="majorBidi" w:cstheme="majorBidi"/>
-        </w:rPr>
-      </w:pPr>
-    </w:p>
-    <w:p>
-      <w:pPr>
-        <w:pStyle w:val="Heading2"/>
-        <w:rPr>
-          <w:rFonts w:asciiTheme="majorBidi" w:hAnsiTheme="majorBidi"/>
-        </w:rPr>
-      </w:pPr>
-      <w:bookmarkStart w:id="8" w:name="_Toc91714549"/>
-      <w:r>
-        <w:t>Data tables</w:t>
-      </w:r>
-      <w:bookmarkEnd w:id="8"/>
     </w:p>
     <w:p/>
     <w:p>
@@ -3876,6 +3905,7 @@
           <w:noProof/>
           <w:lang w:val="en-IN" w:eastAsia="en-IN"/>
         </w:rPr>
+        <w:lastRenderedPageBreak/>
         <w:drawing>
           <wp:anchor distT="0" distB="0" distL="114300" distR="114300" simplePos="0" relativeHeight="251659264" behindDoc="1" locked="0" layoutInCell="1" allowOverlap="1" wp14:anchorId="2E27E459" wp14:editId="18B07ADD">
             <wp:simplePos x="0" y="0"/>
@@ -3975,11 +4005,11 @@
       <w:pPr>
         <w:pStyle w:val="Heading2"/>
       </w:pPr>
-      <w:bookmarkStart w:id="9" w:name="_Toc91714550"/>
+      <w:bookmarkStart w:id="8" w:name="_Toc91714550"/>
       <w:r>
         <w:t>Graphs</w:t>
       </w:r>
-      <w:bookmarkEnd w:id="9"/>
+      <w:bookmarkEnd w:id="8"/>
     </w:p>
     <w:p/>
     <w:p>
@@ -4068,7 +4098,6 @@
           <w:noProof/>
           <w:lang w:val="en-IN" w:eastAsia="en-IN"/>
         </w:rPr>
-        <w:lastRenderedPageBreak/>
         <w:drawing>
           <wp:inline distT="0" distB="0" distL="0" distR="0" wp14:anchorId="70E6A8EB" wp14:editId="3AD21775">
             <wp:extent cx="5943600" cy="4363085"/>
@@ -4127,24 +4156,14 @@
       <w:r>
         <w:t xml:space="preserve">Figure </w:t>
       </w:r>
-      <w:r>
-        <w:fldChar w:fldCharType="begin"/>
-      </w:r>
-      <w:r>
-        <w:instrText xml:space="preserve"> SEQ Figure \* ARABIC </w:instrText>
-      </w:r>
-      <w:r>
-        <w:fldChar w:fldCharType="separate"/>
-      </w:r>
-      <w:r>
-        <w:rPr>
-          <w:noProof/>
-        </w:rPr>
-        <w:t>3</w:t>
-      </w:r>
-      <w:r>
-        <w:fldChar w:fldCharType="end"/>
-      </w:r>
+      <w:fldSimple w:instr=" SEQ Figure \* ARABIC ">
+        <w:r>
+          <w:rPr>
+            <w:noProof/>
+          </w:rPr>
+          <w:t>3</w:t>
+        </w:r>
+      </w:fldSimple>
       <w:r>
         <w:t xml:space="preserve">: </w:t>
       </w:r>
@@ -4382,88 +4401,87 @@
       <w:pPr>
         <w:pStyle w:val="Heading1"/>
       </w:pPr>
-      <w:bookmarkStart w:id="10" w:name="_Toc91714551"/>
+      <w:bookmarkStart w:id="9" w:name="_Toc91714551"/>
       <w:r>
         <w:t>Discussion</w:t>
       </w:r>
+      <w:bookmarkEnd w:id="9"/>
+    </w:p>
+    <w:p/>
+    <w:p>
+      <w:pPr>
+        <w:autoSpaceDE w:val="0"/>
+        <w:autoSpaceDN w:val="0"/>
+        <w:adjustRightInd w:val="0"/>
+        <w:spacing w:after="0" w:line="240" w:lineRule="auto"/>
+        <w:rPr>
+          <w:rFonts w:asciiTheme="majorBidi" w:hAnsiTheme="majorBidi" w:cstheme="majorBidi"/>
+        </w:rPr>
+      </w:pPr>
+      <w:r>
+        <w:rPr>
+          <w:rFonts w:asciiTheme="majorBidi" w:hAnsiTheme="majorBidi" w:cstheme="majorBidi"/>
+        </w:rPr>
+        <w:t>The discussion section focuses on the main challenges/issues you had to overcome during the</w:t>
+      </w:r>
+      <w:r>
+        <w:rPr>
+          <w:rFonts w:asciiTheme="majorBidi" w:hAnsiTheme="majorBidi" w:cstheme="majorBidi"/>
+        </w:rPr>
+        <w:t xml:space="preserve"> </w:t>
+      </w:r>
+      <w:r>
+        <w:rPr>
+          <w:rFonts w:asciiTheme="majorBidi" w:hAnsiTheme="majorBidi" w:cstheme="majorBidi"/>
+        </w:rPr>
+        <w:t>project. Outline what your approach does better than the ones you mentioned in your related</w:t>
+      </w:r>
+      <w:r>
+        <w:rPr>
+          <w:rFonts w:asciiTheme="majorBidi" w:hAnsiTheme="majorBidi" w:cstheme="majorBidi"/>
+        </w:rPr>
+        <w:t xml:space="preserve"> </w:t>
+      </w:r>
+      <w:r>
+        <w:rPr>
+          <w:rFonts w:asciiTheme="majorBidi" w:hAnsiTheme="majorBidi" w:cstheme="majorBidi"/>
+        </w:rPr>
+        <w:t>work, and explain why. Do the same with issues where other solutions outperform your own.</w:t>
+      </w:r>
+      <w:r>
+        <w:rPr>
+          <w:rFonts w:asciiTheme="majorBidi" w:hAnsiTheme="majorBidi" w:cstheme="majorBidi"/>
+        </w:rPr>
+        <w:t xml:space="preserve"> </w:t>
+      </w:r>
+      <w:r>
+        <w:rPr>
+          <w:rFonts w:asciiTheme="majorBidi" w:hAnsiTheme="majorBidi" w:cstheme="majorBidi"/>
+        </w:rPr>
+        <w:t>Are there limitations to your approach? If so, what would you recommend towards removing/mitigating them? Given the experience you've gathered working on this project, are there</w:t>
+      </w:r>
+      <w:r>
+        <w:rPr>
+          <w:rFonts w:asciiTheme="majorBidi" w:hAnsiTheme="majorBidi" w:cstheme="majorBidi"/>
+        </w:rPr>
+        <w:t xml:space="preserve"> </w:t>
+      </w:r>
+      <w:r>
+        <w:rPr>
+          <w:rFonts w:asciiTheme="majorBidi" w:hAnsiTheme="majorBidi" w:cstheme="majorBidi"/>
+        </w:rPr>
+        <w:t>other approaches that you feel are worth exploring?</w:t>
+      </w:r>
+    </w:p>
+    <w:p>
+      <w:pPr>
+        <w:pStyle w:val="Heading1"/>
+      </w:pPr>
+      <w:bookmarkStart w:id="10" w:name="_Toc91714552"/>
+      <w:r>
+        <w:t>Conclusion</w:t>
+      </w:r>
       <w:bookmarkEnd w:id="10"/>
-    </w:p>
-    <w:p/>
-    <w:p>
-      <w:pPr>
-        <w:autoSpaceDE w:val="0"/>
-        <w:autoSpaceDN w:val="0"/>
-        <w:adjustRightInd w:val="0"/>
-        <w:spacing w:after="0" w:line="240" w:lineRule="auto"/>
-        <w:rPr>
-          <w:rFonts w:asciiTheme="majorBidi" w:hAnsiTheme="majorBidi" w:cstheme="majorBidi"/>
-        </w:rPr>
-      </w:pPr>
-      <w:r>
-        <w:rPr>
-          <w:rFonts w:asciiTheme="majorBidi" w:hAnsiTheme="majorBidi" w:cstheme="majorBidi"/>
-        </w:rPr>
-        <w:t>The discussion section focuses on the main challenges/issues you had to overcome during the</w:t>
-      </w:r>
-      <w:r>
-        <w:rPr>
-          <w:rFonts w:asciiTheme="majorBidi" w:hAnsiTheme="majorBidi" w:cstheme="majorBidi"/>
-        </w:rPr>
-        <w:t xml:space="preserve"> </w:t>
-      </w:r>
-      <w:r>
-        <w:rPr>
-          <w:rFonts w:asciiTheme="majorBidi" w:hAnsiTheme="majorBidi" w:cstheme="majorBidi"/>
-        </w:rPr>
-        <w:t>project. Outline what your approach does better than the ones you mentioned in your related</w:t>
-      </w:r>
-      <w:r>
-        <w:rPr>
-          <w:rFonts w:asciiTheme="majorBidi" w:hAnsiTheme="majorBidi" w:cstheme="majorBidi"/>
-        </w:rPr>
-        <w:t xml:space="preserve"> </w:t>
-      </w:r>
-      <w:r>
-        <w:rPr>
-          <w:rFonts w:asciiTheme="majorBidi" w:hAnsiTheme="majorBidi" w:cstheme="majorBidi"/>
-        </w:rPr>
-        <w:t>work, and explain why. Do the same with issues where other solutions outperform your own.</w:t>
-      </w:r>
-      <w:r>
-        <w:rPr>
-          <w:rFonts w:asciiTheme="majorBidi" w:hAnsiTheme="majorBidi" w:cstheme="majorBidi"/>
-        </w:rPr>
-        <w:t xml:space="preserve"> </w:t>
-      </w:r>
-      <w:r>
-        <w:rPr>
-          <w:rFonts w:asciiTheme="majorBidi" w:hAnsiTheme="majorBidi" w:cstheme="majorBidi"/>
-        </w:rPr>
-        <w:t>Are there limitations to your approach? If so, what would you recommend towards removing/mitigating them? Given the experience you've gathered working on this project, are there</w:t>
-      </w:r>
-      <w:r>
-        <w:rPr>
-          <w:rFonts w:asciiTheme="majorBidi" w:hAnsiTheme="majorBidi" w:cstheme="majorBidi"/>
-        </w:rPr>
-        <w:t xml:space="preserve"> </w:t>
-      </w:r>
-      <w:r>
-        <w:rPr>
-          <w:rFonts w:asciiTheme="majorBidi" w:hAnsiTheme="majorBidi" w:cstheme="majorBidi"/>
-        </w:rPr>
-        <w:t>other approaches that you feel are worth exploring?</w:t>
-      </w:r>
-    </w:p>
-    <w:p>
-      <w:pPr>
-        <w:pStyle w:val="Heading1"/>
-      </w:pPr>
-      <w:bookmarkStart w:id="11" w:name="_Toc91714552"/>
-      <w:r>
-        <w:lastRenderedPageBreak/>
-        <w:t>Conclusion</w:t>
-      </w:r>
-      <w:bookmarkEnd w:id="11"/>
     </w:p>
     <w:p/>
     <w:p>
@@ -4541,7 +4559,6 @@
           <w:id w:val="2090499800"/>
           <w:citation/>
         </w:sdtPr>
-        <w:sdtEndPr/>
         <w:sdtContent>
           <w:r>
             <w:rPr>
@@ -4668,7 +4685,7 @@
     </w:p>
     <w:p/>
     <w:p/>
-    <w:bookmarkStart w:id="12" w:name="_Toc91714553" w:displacedByCustomXml="next"/>
+    <w:bookmarkStart w:id="11" w:name="_Toc91714553" w:displacedByCustomXml="next"/>
     <w:sdt>
       <w:sdtPr>
         <w:rPr>
@@ -4681,7 +4698,6 @@
           <w:docPartUnique/>
         </w:docPartObj>
       </w:sdtPr>
-      <w:sdtEndPr/>
       <w:sdtContent>
         <w:p>
           <w:pPr>
@@ -4690,14 +4706,13 @@
           <w:r>
             <w:t>Bibliography</w:t>
           </w:r>
-          <w:bookmarkEnd w:id="12"/>
+          <w:bookmarkEnd w:id="11"/>
         </w:p>
         <w:sdt>
           <w:sdtPr>
             <w:id w:val="111145805"/>
             <w:bibliography/>
           </w:sdtPr>
-          <w:sdtEndPr/>
           <w:sdtContent>
             <w:p>
               <w:pPr>
@@ -4930,6 +4945,7 @@
                   <w:bCs/>
                   <w:noProof/>
                 </w:rPr>
+                <w:lastRenderedPageBreak/>
                 <w:fldChar w:fldCharType="end"/>
               </w:r>
             </w:p>
@@ -4984,7 +5000,7 @@
 </file>
 
 <file path=word/numbering.xml><?xml version="1.0" encoding="utf-8"?>
-<w:numbering xmlns:wpc="http://schemas.microsoft.com/office/word/2010/wordprocessingCanvas" xmlns:cx="http://schemas.microsoft.com/office/drawing/2014/chartex" xmlns:mc="http://schemas.openxmlformats.org/markup-compatibility/2006" xmlns:o="urn:schemas-microsoft-com:office:office" xmlns:r="http://schemas.openxmlformats.org/officeDocument/2006/relationships" xmlns:m="http://schemas.openxmlformats.org/officeDocument/2006/math" xmlns:v="urn:schemas-microsoft-com:vml" xmlns:wp14="http://schemas.microsoft.com/office/word/2010/wordprocessingDrawing" xmlns:wp="http://schemas.openxmlformats.org/drawingml/2006/wordprocessingDrawing" xmlns:w10="urn:schemas-microsoft-com:office:word" xmlns:w="http://schemas.openxmlformats.org/wordprocessingml/2006/main" xmlns:w14="http://schemas.microsoft.com/office/word/2010/wordml" xmlns:w15="http://schemas.microsoft.com/office/word/2012/wordml" xmlns:w16se="http://schemas.microsoft.com/office/word/2015/wordml/symex" xmlns:wpg="http://schemas.microsoft.com/office/word/2010/wordprocessingGroup" xmlns:wpi="http://schemas.microsoft.com/office/word/2010/wordprocessingInk" xmlns:wne="http://schemas.microsoft.com/office/word/2006/wordml" xmlns:wps="http://schemas.microsoft.com/office/word/2010/wordprocessingShape" mc:Ignorable="w14 w15 w16se wp14">
+<w:numbering xmlns:wpc="http://schemas.microsoft.com/office/word/2010/wordprocessingCanvas" xmlns:cx="http://schemas.microsoft.com/office/drawing/2014/chartex" xmlns:cx1="http://schemas.microsoft.com/office/drawing/2015/9/8/chartex" xmlns:cx2="http://schemas.microsoft.com/office/drawing/2015/10/21/chartex" xmlns:cx3="http://schemas.microsoft.com/office/drawing/2016/5/9/chartex" xmlns:cx4="http://schemas.microsoft.com/office/drawing/2016/5/10/chartex" xmlns:cx5="http://schemas.microsoft.com/office/drawing/2016/5/11/chartex" xmlns:cx6="http://schemas.microsoft.com/office/drawing/2016/5/12/chartex" xmlns:cx7="http://schemas.microsoft.com/office/drawing/2016/5/13/chartex" xmlns:cx8="http://schemas.microsoft.com/office/drawing/2016/5/14/chartex" xmlns:mc="http://schemas.openxmlformats.org/markup-compatibility/2006" xmlns:aink="http://schemas.microsoft.com/office/drawing/2016/ink" xmlns:am3d="http://schemas.microsoft.com/office/drawing/2017/model3d" xmlns:o="urn:schemas-microsoft-com:office:office" xmlns:oel="http://schemas.microsoft.com/office/2019/extlst" xmlns:r="http://schemas.openxmlformats.org/officeDocument/2006/relationships" xmlns:m="http://schemas.openxmlformats.org/officeDocument/2006/math" xmlns:v="urn:schemas-microsoft-com:vml" xmlns:wp14="http://schemas.microsoft.com/office/word/2010/wordprocessingDrawing" xmlns:wp="http://schemas.openxmlformats.org/drawingml/2006/wordprocessingDrawing" xmlns:w10="urn:schemas-microsoft-com:office:word" xmlns:w="http://schemas.openxmlformats.org/wordprocessingml/2006/main" xmlns:w14="http://schemas.microsoft.com/office/word/2010/wordml" xmlns:w15="http://schemas.microsoft.com/office/word/2012/wordml" xmlns:w16cex="http://schemas.microsoft.com/office/word/2018/wordml/cex" xmlns:w16cid="http://schemas.microsoft.com/office/word/2016/wordml/cid" xmlns:w16="http://schemas.microsoft.com/office/word/2018/wordml" xmlns:w16du="http://schemas.microsoft.com/office/word/2023/wordml/word16du" xmlns:w16sdtdh="http://schemas.microsoft.com/office/word/2020/wordml/sdtdatahash" xmlns:w16sdtfl="http://schemas.microsoft.com/office/word/2024/wordml/sdtformatlock" xmlns:w16se="http://schemas.microsoft.com/office/word/2015/wordml/symex" xmlns:wpg="http://schemas.microsoft.com/office/word/2010/wordprocessingGroup" xmlns:wpi="http://schemas.microsoft.com/office/word/2010/wordprocessingInk" xmlns:wne="http://schemas.microsoft.com/office/word/2006/wordml" xmlns:wps="http://schemas.microsoft.com/office/word/2010/wordprocessingShape" mc:Ignorable="w14 w15 w16se w16cid w16 w16cex w16sdtdh w16sdtfl w16du wp14">
   <w:abstractNum w:abstractNumId="0" w15:restartNumberingAfterBreak="0">
     <w:nsid w:val="17635CD0"/>
     <w:multiLevelType w:val="multilevel"/>
@@ -6628,68 +6644,68 @@
       </w:pPr>
     </w:lvl>
   </w:abstractNum>
-  <w:num w:numId="1">
+  <w:num w:numId="1" w16cid:durableId="637880059">
     <w:abstractNumId w:val="17"/>
   </w:num>
-  <w:num w:numId="2">
+  <w:num w:numId="2" w16cid:durableId="309287406">
     <w:abstractNumId w:val="16"/>
   </w:num>
-  <w:num w:numId="3">
+  <w:num w:numId="3" w16cid:durableId="1824853413">
     <w:abstractNumId w:val="4"/>
   </w:num>
-  <w:num w:numId="4">
+  <w:num w:numId="4" w16cid:durableId="555045222">
     <w:abstractNumId w:val="6"/>
   </w:num>
-  <w:num w:numId="5">
+  <w:num w:numId="5" w16cid:durableId="1502742860">
     <w:abstractNumId w:val="10"/>
   </w:num>
-  <w:num w:numId="6">
+  <w:num w:numId="6" w16cid:durableId="2062055689">
     <w:abstractNumId w:val="11"/>
   </w:num>
-  <w:num w:numId="7">
+  <w:num w:numId="7" w16cid:durableId="183980735">
     <w:abstractNumId w:val="5"/>
   </w:num>
-  <w:num w:numId="8">
+  <w:num w:numId="8" w16cid:durableId="1473136451">
     <w:abstractNumId w:val="9"/>
   </w:num>
-  <w:num w:numId="9">
+  <w:num w:numId="9" w16cid:durableId="1043214634">
     <w:abstractNumId w:val="7"/>
   </w:num>
-  <w:num w:numId="10">
+  <w:num w:numId="10" w16cid:durableId="1826242501">
     <w:abstractNumId w:val="13"/>
   </w:num>
-  <w:num w:numId="11">
+  <w:num w:numId="11" w16cid:durableId="839076444">
     <w:abstractNumId w:val="0"/>
   </w:num>
-  <w:num w:numId="12">
+  <w:num w:numId="12" w16cid:durableId="938832702">
     <w:abstractNumId w:val="12"/>
   </w:num>
-  <w:num w:numId="13">
+  <w:num w:numId="13" w16cid:durableId="1349454420">
     <w:abstractNumId w:val="2"/>
   </w:num>
-  <w:num w:numId="14">
+  <w:num w:numId="14" w16cid:durableId="133451469">
     <w:abstractNumId w:val="1"/>
   </w:num>
-  <w:num w:numId="15">
+  <w:num w:numId="15" w16cid:durableId="1947958633">
     <w:abstractNumId w:val="15"/>
   </w:num>
-  <w:num w:numId="16">
+  <w:num w:numId="16" w16cid:durableId="85155553">
     <w:abstractNumId w:val="14"/>
   </w:num>
-  <w:num w:numId="17">
+  <w:num w:numId="17" w16cid:durableId="639963903">
     <w:abstractNumId w:val="8"/>
   </w:num>
-  <w:num w:numId="18">
+  <w:num w:numId="18" w16cid:durableId="1119370657">
     <w:abstractNumId w:val="3"/>
   </w:num>
-  <w:num w:numId="19">
+  <w:num w:numId="19" w16cid:durableId="926618426">
     <w:abstractNumId w:val="18"/>
   </w:num>
 </w:numbering>
 </file>
 
 <file path=word/styles.xml><?xml version="1.0" encoding="utf-8"?>
-<w:styles xmlns:mc="http://schemas.openxmlformats.org/markup-compatibility/2006" xmlns:r="http://schemas.openxmlformats.org/officeDocument/2006/relationships" xmlns:w="http://schemas.openxmlformats.org/wordprocessingml/2006/main" xmlns:w14="http://schemas.microsoft.com/office/word/2010/wordml" xmlns:w15="http://schemas.microsoft.com/office/word/2012/wordml" xmlns:w16se="http://schemas.microsoft.com/office/word/2015/wordml/symex" mc:Ignorable="w14 w15 w16se">
+<w:styles xmlns:mc="http://schemas.openxmlformats.org/markup-compatibility/2006" xmlns:r="http://schemas.openxmlformats.org/officeDocument/2006/relationships" xmlns:w="http://schemas.openxmlformats.org/wordprocessingml/2006/main" xmlns:w14="http://schemas.microsoft.com/office/word/2010/wordml" xmlns:w15="http://schemas.microsoft.com/office/word/2012/wordml" xmlns:w16cex="http://schemas.microsoft.com/office/word/2018/wordml/cex" xmlns:w16cid="http://schemas.microsoft.com/office/word/2016/wordml/cid" xmlns:w16="http://schemas.microsoft.com/office/word/2018/wordml" xmlns:w16du="http://schemas.microsoft.com/office/word/2023/wordml/word16du" xmlns:w16sdtdh="http://schemas.microsoft.com/office/word/2020/wordml/sdtdatahash" xmlns:w16sdtfl="http://schemas.microsoft.com/office/word/2024/wordml/sdtformatlock" xmlns:w16se="http://schemas.microsoft.com/office/word/2015/wordml/symex" mc:Ignorable="w14 w15 w16se w16cid w16 w16cex w16sdtdh w16sdtfl w16du">
   <w:docDefaults>
     <w:rPrDefault>
       <w:rPr>
@@ -6705,7 +6721,7 @@
       </w:pPr>
     </w:pPrDefault>
   </w:docDefaults>
-  <w:latentStyles w:defLockedState="0" w:defUIPriority="99" w:defSemiHidden="0" w:defUnhideWhenUsed="0" w:defQFormat="0" w:count="371">
+  <w:latentStyles w:defLockedState="0" w:defUIPriority="99" w:defSemiHidden="0" w:defUnhideWhenUsed="0" w:defQFormat="0" w:count="376">
     <w:lsdException w:name="Normal" w:uiPriority="0" w:qFormat="1"/>
     <w:lsdException w:name="heading 1" w:uiPriority="9" w:qFormat="1"/>
     <w:lsdException w:name="heading 2" w:semiHidden="1" w:uiPriority="9" w:unhideWhenUsed="1" w:qFormat="1"/>
@@ -7077,6 +7093,11 @@
     <w:lsdException w:name="List Table 5 Dark Accent 6" w:uiPriority="50"/>
     <w:lsdException w:name="List Table 6 Colorful Accent 6" w:uiPriority="51"/>
     <w:lsdException w:name="List Table 7 Colorful Accent 6" w:uiPriority="52"/>
+    <w:lsdException w:name="Mention" w:semiHidden="1" w:unhideWhenUsed="1"/>
+    <w:lsdException w:name="Smart Hyperlink" w:semiHidden="1" w:unhideWhenUsed="1"/>
+    <w:lsdException w:name="Hashtag" w:semiHidden="1" w:unhideWhenUsed="1"/>
+    <w:lsdException w:name="Unresolved Mention" w:semiHidden="1" w:unhideWhenUsed="1"/>
+    <w:lsdException w:name="Smart Link" w:semiHidden="1" w:unhideWhenUsed="1"/>
   </w:latentStyles>
   <w:style w:type="paragraph" w:default="1" w:styleId="Normal">
     <w:name w:val="Normal"/>

</xml_diff>